<commit_message>
Primer experimento en rama
</commit_message>
<xml_diff>
--- a/mi_documento1.docx
+++ b/mi_documento1.docx
@@ -26,7 +26,6 @@
     <w:p>
       <w:pPr>
         <w:rPr>
-          <w:u w:val="single"/>
           <w:lang w:val="es-ES"/>
         </w:rPr>
       </w:pPr>
@@ -48,6 +47,40 @@
             <w:t>😊</w:t>
           </mc:Fallback>
         </mc:AlternateContent>
+      </w:r>
+    </w:p>
+    <w:p>
+      <w:pPr>
+        <w:rPr>
+          <w:lang w:val="es-ES"/>
+        </w:rPr>
+      </w:pPr>
+    </w:p>
+    <w:p>
+      <w:pPr>
+        <w:rPr>
+          <w:lang w:val="es-ES"/>
+        </w:rPr>
+      </w:pPr>
+      <w:r>
+        <w:rPr>
+          <w:lang w:val="es-ES"/>
+        </w:rPr>
+        <w:t>RAMA 1</w:t>
+      </w:r>
+    </w:p>
+    <w:p>
+      <w:pPr>
+        <w:rPr>
+          <w:u w:val="single"/>
+          <w:lang w:val="es-ES"/>
+        </w:rPr>
+      </w:pPr>
+      <w:r>
+        <w:rPr>
+          <w:lang w:val="es-ES"/>
+        </w:rPr>
+        <w:t xml:space="preserve">LA LAMPARA ES AMARILLA </w:t>
       </w:r>
     </w:p>
     <w:sectPr>

</xml_diff>